<commit_message>
Add MES and factory automation experience to resume
Co-Authored-By: Claude Sonnet 5.5 <noreply@anthropic.com>
Claude-Session: https://claude.ai/code/session_017zFuymBkpuNSgkMZbowUa7
</commit_message>
<xml_diff>
--- a/resume/Sree_Pavan_Kothapalli_MES_Resume.docx
+++ b/resume/Sree_Pavan_Kothapalli_MES_Resume.docx
@@ -61,6 +61,22 @@
           <w:sz w:val="22"/>
         </w:rPr>
         <w:t>TECHNICAL SKILLS</w:t>
+      </w:r>
+    </w:p>
+    <w:p>
+      <w:pPr>
+        <w:pStyle w:val="ListBullet"/>
+        <w:spacing w:after="30"/>
+        <w:ind w:left="360"/>
+      </w:pPr>
+      <w:r>
+        <w:rPr>
+          <w:b/>
+        </w:rPr>
+        <w:t xml:space="preserve">MES &amp; Factory Automation: </w:t>
+      </w:r>
+      <w:r>
+        <w:t>MES Configuration &amp; Support, CIM/EAP Integration, Equipment Interfaces, Manufacturing Master Data, Traceability, Quality Data Integration, UAT, Go-Live &amp; Post Go-Live Support</w:t>
       </w:r>
     </w:p>
     <w:p>
@@ -395,6 +411,256 @@
       </w:pPr>
       <w:r>
         <w:t>Supported scalable, event-driven architectures capable of handling high-throughput operational data with low processing latency.</w:t>
+      </w:r>
+    </w:p>
+    <w:p>
+      <w:pPr>
+        <w:spacing w:before="60"/>
+      </w:pPr>
+      <w:r>
+        <w:rPr>
+          <w:b/>
+          <w:i/>
+        </w:rPr>
+        <w:t>MES &amp; Manufacturing Systems</w:t>
+      </w:r>
+    </w:p>
+    <w:p>
+      <w:pPr>
+        <w:pStyle w:val="ListBullet"/>
+        <w:spacing w:after="30"/>
+        <w:ind w:left="360"/>
+      </w:pPr>
+      <w:r>
+        <w:t>Developed, configured, tested, and supported Manufacturing Execution System (MES) applications to enable automated production execution, process monitoring, and manufacturing operations.</w:t>
+      </w:r>
+    </w:p>
+    <w:p>
+      <w:pPr>
+        <w:pStyle w:val="ListBullet"/>
+        <w:spacing w:after="30"/>
+        <w:ind w:left="360"/>
+      </w:pPr>
+      <w:r>
+        <w:t>Translated manufacturing business requirements into MES configurations, system enhancements, technical specifications, and automated workflows.</w:t>
+      </w:r>
+    </w:p>
+    <w:p>
+      <w:pPr>
+        <w:pStyle w:val="ListBullet"/>
+        <w:spacing w:after="30"/>
+        <w:ind w:left="360"/>
+      </w:pPr>
+      <w:r>
+        <w:t>Integrated MES with Computer Integrated Manufacturing (CIM), Equipment Automation Programs (EAP), and manufacturing data platforms to enable seamless production data exchange.</w:t>
+      </w:r>
+    </w:p>
+    <w:p>
+      <w:pPr>
+        <w:pStyle w:val="ListBullet"/>
+        <w:spacing w:after="30"/>
+        <w:ind w:left="360"/>
+      </w:pPr>
+      <w:r>
+        <w:t>Configured and maintained manufacturing master data, including process flows, equipment definitions, production recipes, material information, and operational parameters.</w:t>
+      </w:r>
+    </w:p>
+    <w:p>
+      <w:pPr>
+        <w:pStyle w:val="ListBullet"/>
+        <w:spacing w:after="30"/>
+        <w:ind w:left="360"/>
+      </w:pPr>
+      <w:r>
+        <w:t>Supported MES functionality for work-order execution, production tracking, equipment status monitoring, and manufacturing process traceability.</w:t>
+      </w:r>
+    </w:p>
+    <w:p>
+      <w:pPr>
+        <w:spacing w:before="60"/>
+      </w:pPr>
+      <w:r>
+        <w:rPr>
+          <w:b/>
+          <w:i/>
+        </w:rPr>
+        <w:t>Equipment Integration &amp; Factory Automation</w:t>
+      </w:r>
+    </w:p>
+    <w:p>
+      <w:pPr>
+        <w:pStyle w:val="ListBullet"/>
+        <w:spacing w:after="30"/>
+        <w:ind w:left="360"/>
+      </w:pPr>
+      <w:r>
+        <w:t>Developed and supported equipment integration interfaces to enable automated exchange of equipment events, process parameters, and production status information.</w:t>
+      </w:r>
+    </w:p>
+    <w:p>
+      <w:pPr>
+        <w:pStyle w:val="ListBullet"/>
+        <w:spacing w:after="30"/>
+        <w:ind w:left="360"/>
+      </w:pPr>
+      <w:r>
+        <w:t>Collaborated with equipment vendors and automation engineers to configure, test, and troubleshoot manufacturing equipment interfaces.</w:t>
+      </w:r>
+    </w:p>
+    <w:p>
+      <w:pPr>
+        <w:pStyle w:val="ListBullet"/>
+        <w:spacing w:after="30"/>
+        <w:ind w:left="360"/>
+      </w:pPr>
+      <w:r>
+        <w:t>Integrated factory automation systems with enterprise data platforms to support real-time equipment monitoring and manufacturing analytics.</w:t>
+      </w:r>
+    </w:p>
+    <w:p>
+      <w:pPr>
+        <w:pStyle w:val="ListBullet"/>
+        <w:spacing w:after="30"/>
+        <w:ind w:left="360"/>
+      </w:pPr>
+      <w:r>
+        <w:t>Supported automated equipment data collection and event-driven workflows to reduce manual intervention in factory operations.</w:t>
+      </w:r>
+    </w:p>
+    <w:p>
+      <w:pPr>
+        <w:spacing w:before="60"/>
+      </w:pPr>
+      <w:r>
+        <w:rPr>
+          <w:b/>
+          <w:i/>
+        </w:rPr>
+        <w:t>Quality &amp; Manufacturing Data</w:t>
+      </w:r>
+    </w:p>
+    <w:p>
+      <w:pPr>
+        <w:pStyle w:val="ListBullet"/>
+        <w:spacing w:after="30"/>
+        <w:ind w:left="360"/>
+      </w:pPr>
+      <w:r>
+        <w:t>Integrated manufacturing quality data with production execution systems to support quality monitoring, validation, and traceability.</w:t>
+      </w:r>
+    </w:p>
+    <w:p>
+      <w:pPr>
+        <w:pStyle w:val="ListBullet"/>
+        <w:spacing w:after="30"/>
+        <w:ind w:left="360"/>
+      </w:pPr>
+      <w:r>
+        <w:t>Implemented data validation and reconciliation controls to improve the accuracy and consistency of manufacturing process data.</w:t>
+      </w:r>
+    </w:p>
+    <w:p>
+      <w:pPr>
+        <w:pStyle w:val="ListBullet"/>
+        <w:spacing w:after="30"/>
+        <w:ind w:left="360"/>
+      </w:pPr>
+      <w:r>
+        <w:t>Supported manufacturing data models covering materials, recipes, process steps, equipment, and production events.</w:t>
+      </w:r>
+    </w:p>
+    <w:p>
+      <w:pPr>
+        <w:spacing w:before="60"/>
+      </w:pPr>
+      <w:r>
+        <w:rPr>
+          <w:b/>
+          <w:i/>
+        </w:rPr>
+        <w:t>Testing, UAT &amp; Go-Live</w:t>
+      </w:r>
+    </w:p>
+    <w:p>
+      <w:pPr>
+        <w:pStyle w:val="ListBullet"/>
+        <w:spacing w:after="30"/>
+        <w:ind w:left="360"/>
+      </w:pPr>
+      <w:r>
+        <w:t>Participated in functional testing, integration testing, User Acceptance Testing (UAT), and defect resolution for MES and factory automation applications.</w:t>
+      </w:r>
+    </w:p>
+    <w:p>
+      <w:pPr>
+        <w:pStyle w:val="ListBullet"/>
+        <w:spacing w:after="30"/>
+        <w:ind w:left="360"/>
+      </w:pPr>
+      <w:r>
+        <w:t>Supported system deployment, manufacturing go-live readiness, post-go-live stabilization, and production issue resolution.</w:t>
+      </w:r>
+    </w:p>
+    <w:p>
+      <w:pPr>
+        <w:pStyle w:val="ListBullet"/>
+        <w:spacing w:after="30"/>
+        <w:ind w:left="360"/>
+      </w:pPr>
+      <w:r>
+        <w:t>Investigated application failures, equipment interface errors, and manufacturing data inconsistencies to minimize operational disruption.</w:t>
+      </w:r>
+    </w:p>
+    <w:p>
+      <w:pPr>
+        <w:pStyle w:val="ListBullet"/>
+        <w:spacing w:after="30"/>
+        <w:ind w:left="360"/>
+      </w:pPr>
+      <w:r>
+        <w:t>Prepared test cases, deployment documentation, troubleshooting guides, and standard operating procedures.</w:t>
+      </w:r>
+    </w:p>
+    <w:p>
+      <w:pPr>
+        <w:spacing w:before="60"/>
+      </w:pPr>
+      <w:r>
+        <w:rPr>
+          <w:b/>
+          <w:i/>
+        </w:rPr>
+        <w:t>Collaboration &amp; AI-Enabled Manufacturing</w:t>
+      </w:r>
+    </w:p>
+    <w:p>
+      <w:pPr>
+        <w:pStyle w:val="ListBullet"/>
+        <w:spacing w:after="30"/>
+        <w:ind w:left="360"/>
+      </w:pPr>
+      <w:r>
+        <w:t>Collaborated with manufacturing, quality, IT, automation, and vendor teams to gather requirements and deliver integrated factory software solutions.</w:t>
+      </w:r>
+    </w:p>
+    <w:p>
+      <w:pPr>
+        <w:pStyle w:val="ListBullet"/>
+        <w:spacing w:after="30"/>
+        <w:ind w:left="360"/>
+      </w:pPr>
+      <w:r>
+        <w:t>Developed AI-enabled manufacturing analytics workflows to identify equipment anomalies and support predictive maintenance.</w:t>
+      </w:r>
+    </w:p>
+    <w:p>
+      <w:pPr>
+        <w:pStyle w:val="ListBullet"/>
+        <w:spacing w:after="30"/>
+        <w:ind w:left="360"/>
+      </w:pPr>
+      <w:r>
+        <w:t>Supported implementation of scalable factory systems in a greenfield manufacturing environment.</w:t>
       </w:r>
     </w:p>
     <w:p>

</xml_diff>

<commit_message>
Tighten resume summary and condense experience to two pages
Co-Authored-By: Claude Sonnet 5.5 <noreply@anthropic.com>
Claude-Session: https://claude.ai/code/session_017zFuymBkpuNSgkMZbowUa7
</commit_message>
<xml_diff>
--- a/resume/Sree_Pavan_Kothapalli_MES_Resume.docx
+++ b/resume/Sree_Pavan_Kothapalli_MES_Resume.docx
@@ -28,7 +28,7 @@
     </w:p>
     <w:p>
       <w:pPr>
-        <w:spacing w:before="140" w:after="60"/>
+        <w:spacing w:before="100" w:after="60"/>
         <w:pBdr>
           <w:bottom w:val="single" w:sz="6" w:space="1" w:color="1F3864"/>
         </w:pBdr>
@@ -44,12 +44,12 @@
     </w:p>
     <w:p>
       <w:r>
-        <w:t>Software Engineer and Data Engineer with 3 years of experience designing, developing, integrating, and supporting scalable enterprise data systems, real-time processing platforms, cloud-native architectures, and automated workflows. Strong technical expertise in Python, SQL, Apache Kafka, Azure, AWS, Databricks, PySpark, Docker, Kubernetes, and CI/CD automation. Experienced in enterprise system integration, event-driven architectures, operational data processing, data validation, application monitoring, troubleshooting, and system reliability. Hands-on academic project experience in Industrial IoT, sensor data ingestion, equipment health monitoring, and predictive maintenance analytics. Skilled in implementing secure, scalable, and reliable software solutions with transferable capabilities relevant to Manufacturing Execution Systems (MES), factory automation, manufacturing data integration, and AI-enabled industrial applications.</w:t>
+        <w:t>Software Engineer and Data Engineer with 3 years of experience developing and supporting enterprise data integration, Manufacturing Execution Systems (MES), factory automation workflows, and cloud-native applications. Experienced in MES configuration, CIM/EAP integration, manufacturing master data, equipment interfaces, quality data integration, UAT, go-live support, and production troubleshooting. Strong expertise in Python, SQL, Kafka, Azure, AWS, Databricks, and AI-enabled industrial analytics. Hands-on academic project experience in Industrial IoT, sensor data ingestion, equipment health monitoring, and predictive maintenance analytics.</w:t>
       </w:r>
     </w:p>
     <w:p>
       <w:pPr>
-        <w:spacing w:before="140" w:after="60"/>
+        <w:spacing w:before="100" w:after="60"/>
         <w:pBdr>
           <w:bottom w:val="single" w:sz="6" w:space="1" w:color="1F3864"/>
         </w:pBdr>
@@ -257,7 +257,7 @@
     </w:p>
     <w:p>
       <w:pPr>
-        <w:spacing w:before="140" w:after="60"/>
+        <w:spacing w:before="100" w:after="60"/>
         <w:pBdr>
           <w:bottom w:val="single" w:sz="6" w:space="1" w:color="1F3864"/>
         </w:pBdr>
@@ -315,12 +315,14 @@
     </w:p>
     <w:p>
       <w:pPr>
-        <w:pStyle w:val="ListBullet"/>
-        <w:spacing w:after="30"/>
-        <w:ind w:left="360"/>
+        <w:spacing w:before="60"/>
       </w:pPr>
       <w:r>
-        <w:t>Designed and implemented scalable, real-time enterprise data integration solutions using Apache Kafka, Kafka Connect, and Schema Registry to enable reliable communication between distributed applications and data platforms, handling 1M+ events per minute with sub-second latency.</w:t>
+        <w:rPr>
+          <w:b/>
+          <w:i/>
+        </w:rPr>
+        <w:t>Enterprise Data Integration</w:t>
       </w:r>
     </w:p>
     <w:p>
@@ -330,7 +332,7 @@
         <w:ind w:left="360"/>
       </w:pPr>
       <w:r>
-        <w:t>Developed automated data processing workflows using Python, SQL, Databricks, and Delta Lake to support high-volume operational data ingestion, transformation, and analytics.</w:t>
+        <w:t>Designed and implemented scalable, real-time integration solutions using Apache Kafka, Kafka Connect, and Schema Registry for reliable, consistent data exchange across distributed applications and heterogeneous systems, handling 1M+ events per minute with sub-second latency.</w:t>
       </w:r>
     </w:p>
     <w:p>
@@ -340,7 +342,7 @@
         <w:ind w:left="360"/>
       </w:pPr>
       <w:r>
-        <w:t>Configured Kafka Connect and Schema Registry to maintain consistent data structures and enable reliable data exchange across heterogeneous enterprise systems.</w:t>
+        <w:t>Developed automated Python/SQL workflows and real-time applications on Databricks and Delta Lake for high-volume operational data, processing 50+ TB monthly; integrated Azure Data Factory with Kafka pipelines to move data between on-premises and cloud platforms.</w:t>
       </w:r>
     </w:p>
     <w:p>
@@ -350,7 +352,7 @@
         <w:ind w:left="360"/>
       </w:pPr>
       <w:r>
-        <w:t>Integrated Azure Data Factory with Kafka streaming pipelines to automate data movement between on-premises and cloud-based platforms.</w:t>
+        <w:t>Implemented validation, consistency, access-control, and encryption mechanisms to protect data integrity across distributed processing systems.</w:t>
       </w:r>
     </w:p>
     <w:p>
@@ -360,57 +362,7 @@
         <w:ind w:left="360"/>
       </w:pPr>
       <w:r>
-        <w:t>Implemented data consistency, security, and validation controls to improve data integrity and reliability across distributed processing systems.</w:t>
-      </w:r>
-    </w:p>
-    <w:p>
-      <w:pPr>
-        <w:pStyle w:val="ListBullet"/>
-        <w:spacing w:after="30"/>
-        <w:ind w:left="360"/>
-      </w:pPr>
-      <w:r>
-        <w:t>Built real-time data processing applications using Databricks and Delta Lake, supporting large-scale streaming and analytical workloads of 50+ TB of data monthly.</w:t>
-      </w:r>
-    </w:p>
-    <w:p>
-      <w:pPr>
-        <w:pStyle w:val="ListBullet"/>
-        <w:spacing w:after="30"/>
-        <w:ind w:left="360"/>
-      </w:pPr>
-      <w:r>
-        <w:t>Optimized Spark SQL queries and data models to improve processing performance (50% improvement) and reduce infrastructure overhead.</w:t>
-      </w:r>
-    </w:p>
-    <w:p>
-      <w:pPr>
-        <w:pStyle w:val="ListBullet"/>
-        <w:spacing w:after="30"/>
-        <w:ind w:left="360"/>
-      </w:pPr>
-      <w:r>
-        <w:t>Developed and maintained CI/CD pipelines using Jenkins and Git to automate application deployments and support reliable software releases.</w:t>
-      </w:r>
-    </w:p>
-    <w:p>
-      <w:pPr>
-        <w:pStyle w:val="ListBullet"/>
-        <w:spacing w:after="30"/>
-        <w:ind w:left="360"/>
-      </w:pPr>
-      <w:r>
-        <w:t>Implemented access controls and encryption mechanisms to secure distributed data integration infrastructure.</w:t>
-      </w:r>
-    </w:p>
-    <w:p>
-      <w:pPr>
-        <w:pStyle w:val="ListBullet"/>
-        <w:spacing w:after="30"/>
-        <w:ind w:left="360"/>
-      </w:pPr>
-      <w:r>
-        <w:t>Supported scalable, event-driven architectures capable of handling high-throughput operational data with low processing latency.</w:t>
+        <w:t>Optimized Spark SQL queries and data models, improving performance by 50% and reducing infrastructure cost; built Jenkins/Git CI/CD pipelines for reliable, automated releases.</w:t>
       </w:r>
     </w:p>
     <w:p>
@@ -422,7 +374,7 @@
           <w:b/>
           <w:i/>
         </w:rPr>
-        <w:t>MES &amp; Manufacturing Systems</w:t>
+        <w:t>MES, Equipment Integration &amp; Factory Automation</w:t>
       </w:r>
     </w:p>
     <w:p>
@@ -432,7 +384,7 @@
         <w:ind w:left="360"/>
       </w:pPr>
       <w:r>
-        <w:t>Developed, configured, tested, and supported Manufacturing Execution System (MES) applications to enable automated production execution, process monitoring, and manufacturing operations.</w:t>
+        <w:t>Developed, configured, tested, and supported MES applications for automated production execution and process monitoring; translated manufacturing requirements into MES configurations, enhancements, specifications, and automated workflows.</w:t>
       </w:r>
     </w:p>
     <w:p>
@@ -442,7 +394,7 @@
         <w:ind w:left="360"/>
       </w:pPr>
       <w:r>
-        <w:t>Translated manufacturing business requirements into MES configurations, system enhancements, technical specifications, and automated workflows.</w:t>
+        <w:t>Integrated MES with CIM, EAP, and manufacturing data platforms for production data exchange; configured and maintained master data (process flows, equipment, recipes, materials, operational parameters) supporting work-order execution, production tracking, equipment status monitoring, and traceability.</w:t>
       </w:r>
     </w:p>
     <w:p>
@@ -452,7 +404,7 @@
         <w:ind w:left="360"/>
       </w:pPr>
       <w:r>
-        <w:t>Integrated MES with Computer Integrated Manufacturing (CIM), Equipment Automation Programs (EAP), and manufacturing data platforms to enable seamless production data exchange.</w:t>
+        <w:t>Developed and supported equipment interfaces for automated exchange of equipment events, process parameters, and production status; worked with equipment vendors and automation engineers to configure, test, and troubleshoot them.</w:t>
       </w:r>
     </w:p>
     <w:p>
@@ -462,7 +414,7 @@
         <w:ind w:left="360"/>
       </w:pPr>
       <w:r>
-        <w:t>Configured and maintained manufacturing master data, including process flows, equipment definitions, production recipes, material information, and operational parameters.</w:t>
+        <w:t>Integrated factory automation systems with enterprise data platforms for real-time equipment monitoring, analytics, and event-driven data collection that reduced manual intervention.</w:t>
       </w:r>
     </w:p>
     <w:p>
@@ -472,7 +424,7 @@
         <w:ind w:left="360"/>
       </w:pPr>
       <w:r>
-        <w:t>Supported MES functionality for work-order execution, production tracking, equipment status monitoring, and manufacturing process traceability.</w:t>
+        <w:t>Integrated manufacturing quality data with production execution for monitoring and traceability; implemented validation and reconciliation controls and supported data models for materials, recipes, process steps, equipment, and production events.</w:t>
       </w:r>
     </w:p>
     <w:p>
@@ -484,7 +436,7 @@
           <w:b/>
           <w:i/>
         </w:rPr>
-        <w:t>Equipment Integration &amp; Factory Automation</w:t>
+        <w:t>Testing, UAT, Go-Live &amp; Collaboration</w:t>
       </w:r>
     </w:p>
     <w:p>
@@ -494,7 +446,7 @@
         <w:ind w:left="360"/>
       </w:pPr>
       <w:r>
-        <w:t>Developed and supported equipment integration interfaces to enable automated exchange of equipment events, process parameters, and production status information.</w:t>
+        <w:t>Participated in functional and integration testing, UAT, and defect resolution; supported deployment, go-live readiness, and post-go-live stabilization.</w:t>
       </w:r>
     </w:p>
     <w:p>
@@ -504,7 +456,7 @@
         <w:ind w:left="360"/>
       </w:pPr>
       <w:r>
-        <w:t>Collaborated with equipment vendors and automation engineers to configure, test, and troubleshoot manufacturing equipment interfaces.</w:t>
+        <w:t>Investigated application failures, equipment interface errors, and data inconsistencies to minimize operational disruption; prepared test cases, deployment documentation, troubleshooting guides, and SOPs.</w:t>
       </w:r>
     </w:p>
     <w:p>
@@ -514,143 +466,7 @@
         <w:ind w:left="360"/>
       </w:pPr>
       <w:r>
-        <w:t>Integrated factory automation systems with enterprise data platforms to support real-time equipment monitoring and manufacturing analytics.</w:t>
-      </w:r>
-    </w:p>
-    <w:p>
-      <w:pPr>
-        <w:pStyle w:val="ListBullet"/>
-        <w:spacing w:after="30"/>
-        <w:ind w:left="360"/>
-      </w:pPr>
-      <w:r>
-        <w:t>Supported automated equipment data collection and event-driven workflows to reduce manual intervention in factory operations.</w:t>
-      </w:r>
-    </w:p>
-    <w:p>
-      <w:pPr>
-        <w:spacing w:before="60"/>
-      </w:pPr>
-      <w:r>
-        <w:rPr>
-          <w:b/>
-          <w:i/>
-        </w:rPr>
-        <w:t>Quality &amp; Manufacturing Data</w:t>
-      </w:r>
-    </w:p>
-    <w:p>
-      <w:pPr>
-        <w:pStyle w:val="ListBullet"/>
-        <w:spacing w:after="30"/>
-        <w:ind w:left="360"/>
-      </w:pPr>
-      <w:r>
-        <w:t>Integrated manufacturing quality data with production execution systems to support quality monitoring, validation, and traceability.</w:t>
-      </w:r>
-    </w:p>
-    <w:p>
-      <w:pPr>
-        <w:pStyle w:val="ListBullet"/>
-        <w:spacing w:after="30"/>
-        <w:ind w:left="360"/>
-      </w:pPr>
-      <w:r>
-        <w:t>Implemented data validation and reconciliation controls to improve the accuracy and consistency of manufacturing process data.</w:t>
-      </w:r>
-    </w:p>
-    <w:p>
-      <w:pPr>
-        <w:pStyle w:val="ListBullet"/>
-        <w:spacing w:after="30"/>
-        <w:ind w:left="360"/>
-      </w:pPr>
-      <w:r>
-        <w:t>Supported manufacturing data models covering materials, recipes, process steps, equipment, and production events.</w:t>
-      </w:r>
-    </w:p>
-    <w:p>
-      <w:pPr>
-        <w:spacing w:before="60"/>
-      </w:pPr>
-      <w:r>
-        <w:rPr>
-          <w:b/>
-          <w:i/>
-        </w:rPr>
-        <w:t>Testing, UAT &amp; Go-Live</w:t>
-      </w:r>
-    </w:p>
-    <w:p>
-      <w:pPr>
-        <w:pStyle w:val="ListBullet"/>
-        <w:spacing w:after="30"/>
-        <w:ind w:left="360"/>
-      </w:pPr>
-      <w:r>
-        <w:t>Participated in functional testing, integration testing, User Acceptance Testing (UAT), and defect resolution for MES and factory automation applications.</w:t>
-      </w:r>
-    </w:p>
-    <w:p>
-      <w:pPr>
-        <w:pStyle w:val="ListBullet"/>
-        <w:spacing w:after="30"/>
-        <w:ind w:left="360"/>
-      </w:pPr>
-      <w:r>
-        <w:t>Supported system deployment, manufacturing go-live readiness, post-go-live stabilization, and production issue resolution.</w:t>
-      </w:r>
-    </w:p>
-    <w:p>
-      <w:pPr>
-        <w:pStyle w:val="ListBullet"/>
-        <w:spacing w:after="30"/>
-        <w:ind w:left="360"/>
-      </w:pPr>
-      <w:r>
-        <w:t>Investigated application failures, equipment interface errors, and manufacturing data inconsistencies to minimize operational disruption.</w:t>
-      </w:r>
-    </w:p>
-    <w:p>
-      <w:pPr>
-        <w:pStyle w:val="ListBullet"/>
-        <w:spacing w:after="30"/>
-        <w:ind w:left="360"/>
-      </w:pPr>
-      <w:r>
-        <w:t>Prepared test cases, deployment documentation, troubleshooting guides, and standard operating procedures.</w:t>
-      </w:r>
-    </w:p>
-    <w:p>
-      <w:pPr>
-        <w:spacing w:before="60"/>
-      </w:pPr>
-      <w:r>
-        <w:rPr>
-          <w:b/>
-          <w:i/>
-        </w:rPr>
-        <w:t>Collaboration &amp; AI-Enabled Manufacturing</w:t>
-      </w:r>
-    </w:p>
-    <w:p>
-      <w:pPr>
-        <w:pStyle w:val="ListBullet"/>
-        <w:spacing w:after="30"/>
-        <w:ind w:left="360"/>
-      </w:pPr>
-      <w:r>
-        <w:t>Collaborated with manufacturing, quality, IT, automation, and vendor teams to gather requirements and deliver integrated factory software solutions.</w:t>
-      </w:r>
-    </w:p>
-    <w:p>
-      <w:pPr>
-        <w:pStyle w:val="ListBullet"/>
-        <w:spacing w:after="30"/>
-        <w:ind w:left="360"/>
-      </w:pPr>
-      <w:r>
-        <w:t>Developed AI-enabled manufacturing analytics workflows to identify equipment anomalies and support predictive maintenance.</w:t>
+        <w:t>Collaborated with manufacturing, quality, IT, automation, and vendor teams to deliver integrated factory software solutions, including AI-enabled analytics for equipment anomaly detection and predictive maintenance.</w:t>
       </w:r>
     </w:p>
     <w:p>
@@ -661,17 +477,6 @@
       </w:pPr>
       <w:r>
         <w:t>Supported implementation of scalable factory systems in a greenfield manufacturing environment.</w:t>
-      </w:r>
-    </w:p>
-    <w:p>
-      <w:r>
-        <w:rPr>
-          <w:b/>
-        </w:rPr>
-        <w:t xml:space="preserve">Environment: </w:t>
-      </w:r>
-      <w:r>
-        <w:t>Kafka, Kafka Connect, Schema Registry, Databricks, Spark, Delta Lake, Airflow, ADF, AWS S3/EMR/Glue, Azure Data Lake Gen2, Python, SQL, Bash, Scala, Jenkins, Git, Docker, MLflow, Great Expectations, SQL Server, PostgreSQL, Snowflake, Prometheus, Grafana, Azure Monitor</w:t>
       </w:r>
     </w:p>
     <w:p>
@@ -714,16 +519,6 @@
         </w:rPr>
         <w:tab/>
         <w:t>Houston, Texas</w:t>
-      </w:r>
-    </w:p>
-    <w:p>
-      <w:pPr>
-        <w:pStyle w:val="ListBullet"/>
-        <w:spacing w:after="30"/>
-        <w:ind w:left="360"/>
-      </w:pPr>
-      <w:r>
-        <w:t>Supported senior engineers delivering enterprise data integration solutions for Fortune 500 clients.</w:t>
       </w:r>
     </w:p>
     <w:p>
@@ -900,7 +695,7 @@
     </w:p>
     <w:p>
       <w:pPr>
-        <w:spacing w:before="140" w:after="60"/>
+        <w:spacing w:before="100" w:after="60"/>
         <w:pBdr>
           <w:bottom w:val="single" w:sz="6" w:space="1" w:color="1F3864"/>
         </w:pBdr>
@@ -1113,7 +908,7 @@
     </w:p>
     <w:p>
       <w:pPr>
-        <w:spacing w:before="140" w:after="60"/>
+        <w:spacing w:before="100" w:after="60"/>
         <w:pBdr>
           <w:bottom w:val="single" w:sz="6" w:space="1" w:color="1F3864"/>
         </w:pBdr>
@@ -1124,7 +919,7 @@
           <w:color w:val="1F3864"/>
           <w:sz w:val="22"/>
         </w:rPr>
-        <w:t>EDUCATION</w:t>
+        <w:t>EDUCATION &amp; CERTIFICATIONS</w:t>
       </w:r>
     </w:p>
     <w:p>
@@ -1146,44 +941,13 @@
       </w:r>
     </w:p>
     <w:p>
-      <w:pPr>
-        <w:spacing w:before="140" w:after="60"/>
-        <w:pBdr>
-          <w:bottom w:val="single" w:sz="6" w:space="1" w:color="1F3864"/>
-        </w:pBdr>
-      </w:pPr>
       <w:r>
-        <w:rPr>
-          <w:b/>
-          <w:color w:val="1F3864"/>
-          <w:sz w:val="22"/>
-        </w:rPr>
-        <w:t>CERTIFICATIONS</w:t>
-      </w:r>
-    </w:p>
-    <w:p>
-      <w:pPr>
-        <w:pStyle w:val="ListBullet"/>
-        <w:spacing w:after="30"/>
-        <w:ind w:left="360"/>
-      </w:pPr>
-      <w:r>
-        <w:t>Confluent Certified Administrator for Apache Kafka</w:t>
-      </w:r>
-    </w:p>
-    <w:p>
-      <w:pPr>
-        <w:pStyle w:val="ListBullet"/>
-        <w:spacing w:after="30"/>
-        <w:ind w:left="360"/>
-      </w:pPr>
-      <w:r>
-        <w:t>Databricks Certified Data Engineer Professional</w:t>
+        <w:t>Confluent Certified Administrator for Apache Kafka  |  Databricks Certified Data Engineer Professional</w:t>
       </w:r>
     </w:p>
     <w:sectPr>
       <w:pgSz w:w="12240" w:h="15840"/>
-      <w:pgMar w:top="576" w:right="864" w:bottom="576" w:left="864" w:header="720" w:footer="720" w:gutter="0"/>
+      <w:pgMar w:top="504" w:right="792" w:bottom="504" w:left="792" w:header="720" w:footer="720" w:gutter="0"/>
       <w:cols w:space="720"/>
       <w:docGrid w:linePitch="360"/>
     </w:sectPr>

</xml_diff>

<commit_message>
Remove certifications from resume
Co-Authored-By: Claude Sonnet 5.5 <noreply@anthropic.com>
Claude-Session: https://claude.ai/code/session_017zFuymBkpuNSgkMZbowUa7
</commit_message>
<xml_diff>
--- a/resume/Sree_Pavan_Kothapalli_MES_Resume.docx
+++ b/resume/Sree_Pavan_Kothapalli_MES_Resume.docx
@@ -919,7 +919,7 @@
           <w:color w:val="1F3864"/>
           <w:sz w:val="22"/>
         </w:rPr>
-        <w:t>EDUCATION &amp; CERTIFICATIONS</w:t>
+        <w:t>EDUCATION</w:t>
       </w:r>
     </w:p>
     <w:p>
@@ -938,11 +938,6 @@
         <w:t>, Univ. of North Texas, Denton, TX</w:t>
         <w:tab/>
         <w:t>Aug 2022 – May 2024</w:t>
-      </w:r>
-    </w:p>
-    <w:p>
-      <w:r>
-        <w:t>Confluent Certified Administrator for Apache Kafka  |  Databricks Certified Data Engineer Professional</w:t>
       </w:r>
     </w:p>
     <w:sectPr>

</xml_diff>